<commit_message>
Update Lab 3 report with light/dark screenshots
</commit_message>
<xml_diff>
--- a/LabReport-AryanZia-505899.docx
+++ b/LabReport-AryanZia-505899.docx
@@ -32,6 +32,7 @@
       </w:pPr>
       <w:r>
         <w:rPr>
+          <w:b w:val="0"/>
           <w:sz w:val="22"/>
         </w:rPr>
         <w:t>Class: Fall 2026</w:t>
@@ -55,6 +56,7 @@
       </w:pPr>
       <w:r>
         <w:rPr>
+          <w:b w:val="0"/>
           <w:sz w:val="22"/>
         </w:rPr>
         <w:t>Date: September 24, 2026</w:t>
@@ -66,6 +68,7 @@
       </w:pPr>
       <w:r>
         <w:rPr>
+          <w:b w:val="0"/>
           <w:sz w:val="22"/>
         </w:rPr>
         <w:t>Instructor: Ms. Naema Asif / Dr Muhammad Khuram Shahzad</w:t>
@@ -77,6 +80,7 @@
       </w:pPr>
       <w:r>
         <w:rPr>
+          <w:b w:val="0"/>
           <w:sz w:val="22"/>
         </w:rPr>
         <w:t>Lab Engineer: Engr. Ayesha Asif</w:t>
@@ -240,7 +244,7 @@
           <w:i w:val="0"/>
           <w:sz w:val="22"/>
         </w:rPr>
-        <w:t>In this lab I extended my personal portfolio website (built in Lab 2) by improving the design with external CSS, organizing the project into proper folders, and publishing it online using GitHub Pages. This lab introduced professional practices of project organization, version control and deployment. All styling is now kept in a single external stylesheet, the navigation menu and page content are arranged using the CSS float and clear properties, and the finished website is available live on the internet.</w:t>
+        <w:t>In this lab I extended my personal portfolio website (built in Lab 2) by improving the design with external CSS, organizing the project into proper folders, and publishing it online using GitHub Pages. This lab introduced professional practices of project organization, version control and deployment. All styling is now kept in a single external stylesheet, the navigation menu and page content are arranged using the CSS float and clear properties, and the finished website is available live on the internet. In addition, I gave the website a modern, clean look with a light and dark theme, smooth hover effects and subtle animations - all achieved with pure CSS.</w:t>
       </w:r>
     </w:p>
     <w:p>
@@ -396,7 +400,7 @@
         <w:pStyle w:val="ListBullet"/>
       </w:pPr>
       <w:r>
-        <w:t>Consistent fonts (Segoe UI), colours (#16324f navy and #2e9cca blue), borders, padding and spacing are used across all pages.</w:t>
+        <w:t>A modern design system was built using CSS custom properties (variables) for colours, shadows, spacing and rounded corners, so the whole look can be controlled from one place.</w:t>
       </w:r>
     </w:p>
     <w:p>
@@ -404,7 +408,7 @@
         <w:pStyle w:val="ListBullet"/>
       </w:pPr>
       <w:r>
-        <w:t>The navigation menu is aligned horizontally using float (each list item floats left, and the menu is centred as a whole).</w:t>
+        <w:t>Consistent typography (a system font stack) and a sophisticated slate + indigo colour scheme are used across all pages.</w:t>
       </w:r>
     </w:p>
     <w:p>
@@ -412,7 +416,7 @@
         <w:pStyle w:val="ListBullet"/>
       </w:pPr>
       <w:r>
-        <w:t>The Home page profile picture is floated left so the welcome text wraps neatly beside it.</w:t>
+        <w:t>The navigation menu is aligned horizontally using float (each list item floats left) and is now a sticky, frosted-glass bar.</w:t>
       </w:r>
     </w:p>
     <w:p>
@@ -420,7 +424,7 @@
         <w:pStyle w:val="ListBullet"/>
       </w:pPr>
       <w:r>
-        <w:t>The image gallery is arranged with float, three figures per row.</w:t>
+        <w:t>The Home page profile picture is floated left with a gradient ring, and the welcome text wraps neatly beside it.</w:t>
       </w:r>
     </w:p>
     <w:p>
@@ -428,7 +432,7 @@
         <w:pStyle w:val="ListBullet"/>
       </w:pPr>
       <w:r>
-        <w:t>The clear property (and a clearfix rule) is used to fix the layout problems caused by floated elements so that the cards and footer do not overlap.</w:t>
+        <w:t>The image gallery is arranged with float, three figures per row, and each image zooms smoothly on hover.</w:t>
       </w:r>
     </w:p>
     <w:p>
@@ -436,7 +440,23 @@
         <w:pStyle w:val="ListBullet"/>
       </w:pPr>
       <w:r>
-        <w:t>No JavaScript and no CSS framework were used, as required by the lab.</w:t>
+        <w:t>The clear property (and a clearfix rule) is used to fix the layout problems caused by floated elements so that cards and the footer never overlap.</w:t>
+      </w:r>
+    </w:p>
+    <w:p>
+      <w:pPr>
+        <w:pStyle w:val="ListBullet"/>
+      </w:pPr>
+      <w:r>
+        <w:t>Subtle animations were added with pure CSS: a fade-up on page load, hover lifts on cards and buttons, and animated skill bars.</w:t>
+      </w:r>
+    </w:p>
+    <w:p>
+      <w:pPr>
+        <w:pStyle w:val="ListBullet"/>
+      </w:pPr>
+      <w:r>
+        <w:t>No JavaScript and no CSS framework were used, as required by the lab. All motion is disabled automatically for users who prefer reduced motion.</w:t>
       </w:r>
     </w:p>
     <w:p>
@@ -444,7 +464,7 @@
         <w:pStyle w:val="Heading2"/>
       </w:pPr>
       <w:r>
-        <w:t>4.3 Version Control with Git</w:t>
+        <w:t>4.3 Light and Dark Theme</w:t>
       </w:r>
     </w:p>
     <w:p>
@@ -454,7 +474,25 @@
           <w:i w:val="0"/>
           <w:sz w:val="22"/>
         </w:rPr>
-        <w:t>A Git repository was initialized inside the project folder. All files were committed with a meaningful message, and the repository was pushed to GitHub.</w:t>
+        <w:t>The website supports both a light and a dark theme. By default it follows the operating system / browser preference using the CSS media query prefers-color-scheme. A small sun/moon toggle in the header lets the visitor switch to the opposite theme at any time. This toggle is implemented entirely in CSS using a hidden checkbox and the :has() selector - no JavaScript is used.</w:t>
+      </w:r>
+    </w:p>
+    <w:p>
+      <w:pPr>
+        <w:pStyle w:val="Heading2"/>
+      </w:pPr>
+      <w:r>
+        <w:t>4.4 Version Control with Git</w:t>
+      </w:r>
+    </w:p>
+    <w:p>
+      <w:r>
+        <w:rPr>
+          <w:b w:val="0"/>
+          <w:i w:val="0"/>
+          <w:sz w:val="22"/>
+        </w:rPr>
+        <w:t>A Git repository was initialized inside the project folder. All files were committed with meaningful messages, and the repository was pushed to GitHub.</w:t>
       </w:r>
     </w:p>
     <w:p>
@@ -502,6 +540,18 @@
           <w:rFonts w:ascii="Consolas" w:hAnsi="Consolas"/>
           <w:sz w:val="18"/>
         </w:rPr>
+        <w:t>git commit -m "Redesign UI: modern tokenized CSS, light/dark theme"</w:t>
+      </w:r>
+    </w:p>
+    <w:p>
+      <w:pPr>
+        <w:spacing w:after="0" w:before="0"/>
+      </w:pPr>
+      <w:r>
+        <w:rPr>
+          <w:rFonts w:ascii="Consolas" w:hAnsi="Consolas"/>
+          <w:sz w:val="18"/>
+        </w:rPr>
         <w:t>git remote add origin https://github.com/anithepani/portfolio.git</w:t>
       </w:r>
     </w:p>
@@ -522,7 +572,7 @@
         <w:pStyle w:val="Heading2"/>
       </w:pPr>
       <w:r>
-        <w:t>4.4 Deployment via GitHub Pages</w:t>
+        <w:t>4.5 Deployment via GitHub Pages</w:t>
       </w:r>
     </w:p>
     <w:p>
@@ -532,7 +582,7 @@
           <w:i w:val="0"/>
           <w:sz w:val="22"/>
         </w:rPr>
-        <w:t>GitHub Pages was enabled from the repository settings with the source set to the main branch and the root (/) folder. After the first successful build, the portfolio became available at the live URL below.</w:t>
+        <w:t>GitHub Pages was enabled from the repository settings with the source set to the main branch and the root (/) folder. After the build completed, the portfolio became available at the live URL in Section 7.</w:t>
       </w:r>
     </w:p>
     <w:p>
@@ -756,13 +806,23 @@
       </w:r>
     </w:p>
     <w:p>
+      <w:r>
+        <w:rPr>
+          <w:b w:val="0"/>
+          <w:i w:val="0"/>
+          <w:sz w:val="22"/>
+        </w:rPr>
+        <w:t>The screenshots below show the final website in both themes and the live deployment on GitHub Pages.</w:t>
+      </w:r>
+    </w:p>
+    <w:p>
       <w:pPr>
         <w:jc w:val="center"/>
       </w:pPr>
       <w:r>
         <w:drawing>
           <wp:inline xmlns:a="http://schemas.openxmlformats.org/drawingml/2006/main" xmlns:pic="http://schemas.openxmlformats.org/drawingml/2006/picture">
-            <wp:extent cx="5669280" cy="4207669"/>
+            <wp:extent cx="5669280" cy="4429125"/>
             <wp:docPr id="1" name="Picture 1"/>
             <wp:cNvGraphicFramePr>
               <a:graphicFrameLocks noChangeAspect="1"/>
@@ -771,7 +831,7 @@
               <a:graphicData uri="http://schemas.openxmlformats.org/drawingml/2006/picture">
                 <pic:pic>
                   <pic:nvPicPr>
-                    <pic:cNvPr id="0" name="index.png"/>
+                    <pic:cNvPr id="0" name="theme-light-index.png"/>
                     <pic:cNvPicPr/>
                   </pic:nvPicPr>
                   <pic:blipFill>
@@ -783,7 +843,7 @@
                   <pic:spPr>
                     <a:xfrm>
                       <a:off x="0" y="0"/>
-                      <a:ext cx="5669280" cy="4207669"/>
+                      <a:ext cx="5669280" cy="4429125"/>
                     </a:xfrm>
                     <a:prstGeom prst="rect"/>
                   </pic:spPr>
@@ -803,7 +863,7 @@
           <w:i/>
           <w:sz w:val="18"/>
         </w:rPr>
-        <w:t>Figure 1: Home page (Home) – profile image floated beside the text.</w:t>
+        <w:t>Figure 1: Home page - light theme.</w:t>
       </w:r>
     </w:p>
     <w:p>
@@ -813,7 +873,7 @@
       <w:r>
         <w:drawing>
           <wp:inline xmlns:a="http://schemas.openxmlformats.org/drawingml/2006/main" xmlns:pic="http://schemas.openxmlformats.org/drawingml/2006/picture">
-            <wp:extent cx="5669280" cy="4207669"/>
+            <wp:extent cx="5669280" cy="4429125"/>
             <wp:docPr id="2" name="Picture 2"/>
             <wp:cNvGraphicFramePr>
               <a:graphicFrameLocks noChangeAspect="1"/>
@@ -822,7 +882,7 @@
               <a:graphicData uri="http://schemas.openxmlformats.org/drawingml/2006/picture">
                 <pic:pic>
                   <pic:nvPicPr>
-                    <pic:cNvPr id="0" name="hobbies.png"/>
+                    <pic:cNvPr id="0" name="theme-light-hobbies.png"/>
                     <pic:cNvPicPr/>
                   </pic:nvPicPr>
                   <pic:blipFill>
@@ -834,7 +894,7 @@
                   <pic:spPr>
                     <a:xfrm>
                       <a:off x="0" y="0"/>
-                      <a:ext cx="5669280" cy="4207669"/>
+                      <a:ext cx="5669280" cy="4429125"/>
                     </a:xfrm>
                     <a:prstGeom prst="rect"/>
                   </pic:spPr>
@@ -854,7 +914,7 @@
           <w:i/>
           <w:sz w:val="18"/>
         </w:rPr>
-        <w:t>Figure 2: Hobbies page.</w:t>
+        <w:t>Figure 2: Hobbies page - light theme.</w:t>
       </w:r>
     </w:p>
     <w:p>
@@ -864,7 +924,7 @@
       <w:r>
         <w:drawing>
           <wp:inline xmlns:a="http://schemas.openxmlformats.org/drawingml/2006/main" xmlns:pic="http://schemas.openxmlformats.org/drawingml/2006/picture">
-            <wp:extent cx="5669280" cy="4207669"/>
+            <wp:extent cx="5669280" cy="4429125"/>
             <wp:docPr id="3" name="Picture 3"/>
             <wp:cNvGraphicFramePr>
               <a:graphicFrameLocks noChangeAspect="1"/>
@@ -873,7 +933,7 @@
               <a:graphicData uri="http://schemas.openxmlformats.org/drawingml/2006/picture">
                 <pic:pic>
                   <pic:nvPicPr>
-                    <pic:cNvPr id="0" name="skills.png"/>
+                    <pic:cNvPr id="0" name="theme-light-skills.png"/>
                     <pic:cNvPicPr/>
                   </pic:nvPicPr>
                   <pic:blipFill>
@@ -885,7 +945,7 @@
                   <pic:spPr>
                     <a:xfrm>
                       <a:off x="0" y="0"/>
-                      <a:ext cx="5669280" cy="4207669"/>
+                      <a:ext cx="5669280" cy="4429125"/>
                     </a:xfrm>
                     <a:prstGeom prst="rect"/>
                   </pic:spPr>
@@ -905,7 +965,7 @@
           <w:i/>
           <w:sz w:val="18"/>
         </w:rPr>
-        <w:t>Figure 3: Personal Skills page.</w:t>
+        <w:t>Figure 3: Personal Skills page - light theme.</w:t>
       </w:r>
     </w:p>
     <w:p>
@@ -915,7 +975,7 @@
       <w:r>
         <w:drawing>
           <wp:inline xmlns:a="http://schemas.openxmlformats.org/drawingml/2006/main" xmlns:pic="http://schemas.openxmlformats.org/drawingml/2006/picture">
-            <wp:extent cx="5669280" cy="4207669"/>
+            <wp:extent cx="5669280" cy="4429125"/>
             <wp:docPr id="4" name="Picture 4"/>
             <wp:cNvGraphicFramePr>
               <a:graphicFrameLocks noChangeAspect="1"/>
@@ -924,7 +984,7 @@
               <a:graphicData uri="http://schemas.openxmlformats.org/drawingml/2006/picture">
                 <pic:pic>
                   <pic:nvPicPr>
-                    <pic:cNvPr id="0" name="gallery.png"/>
+                    <pic:cNvPr id="0" name="theme-light-gallery.png"/>
                     <pic:cNvPicPr/>
                   </pic:nvPicPr>
                   <pic:blipFill>
@@ -936,7 +996,7 @@
                   <pic:spPr>
                     <a:xfrm>
                       <a:off x="0" y="0"/>
-                      <a:ext cx="5669280" cy="4207669"/>
+                      <a:ext cx="5669280" cy="4429125"/>
                     </a:xfrm>
                     <a:prstGeom prst="rect"/>
                   </pic:spPr>
@@ -956,7 +1016,7 @@
           <w:i/>
           <w:sz w:val="18"/>
         </w:rPr>
-        <w:t>Figure 4: Image Gallery page – six images arranged using float.</w:t>
+        <w:t>Figure 4: Image Gallery page - light theme (images arranged using float).</w:t>
       </w:r>
     </w:p>
     <w:p>
@@ -966,7 +1026,7 @@
       <w:r>
         <w:drawing>
           <wp:inline xmlns:a="http://schemas.openxmlformats.org/drawingml/2006/main" xmlns:pic="http://schemas.openxmlformats.org/drawingml/2006/picture">
-            <wp:extent cx="5669280" cy="4207669"/>
+            <wp:extent cx="5669280" cy="4429125"/>
             <wp:docPr id="5" name="Picture 5"/>
             <wp:cNvGraphicFramePr>
               <a:graphicFrameLocks noChangeAspect="1"/>
@@ -975,7 +1035,7 @@
               <a:graphicData uri="http://schemas.openxmlformats.org/drawingml/2006/picture">
                 <pic:pic>
                   <pic:nvPicPr>
-                    <pic:cNvPr id="0" name="contact.png"/>
+                    <pic:cNvPr id="0" name="theme-light-contact.png"/>
                     <pic:cNvPicPr/>
                   </pic:nvPicPr>
                   <pic:blipFill>
@@ -987,7 +1047,7 @@
                   <pic:spPr>
                     <a:xfrm>
                       <a:off x="0" y="0"/>
-                      <a:ext cx="5669280" cy="4207669"/>
+                      <a:ext cx="5669280" cy="4429125"/>
                     </a:xfrm>
                     <a:prstGeom prst="rect"/>
                   </pic:spPr>
@@ -1007,7 +1067,7 @@
           <w:i/>
           <w:sz w:val="18"/>
         </w:rPr>
-        <w:t>Figure 5: Contact Me page.</w:t>
+        <w:t>Figure 5: Contact Me page - light theme.</w:t>
       </w:r>
     </w:p>
     <w:p>
@@ -1017,7 +1077,7 @@
       <w:r>
         <w:drawing>
           <wp:inline xmlns:a="http://schemas.openxmlformats.org/drawingml/2006/main" xmlns:pic="http://schemas.openxmlformats.org/drawingml/2006/picture">
-            <wp:extent cx="5669280" cy="4207669"/>
+            <wp:extent cx="5669280" cy="4429125"/>
             <wp:docPr id="6" name="Picture 6"/>
             <wp:cNvGraphicFramePr>
               <a:graphicFrameLocks noChangeAspect="1"/>
@@ -1026,11 +1086,11 @@
               <a:graphicData uri="http://schemas.openxmlformats.org/drawingml/2006/picture">
                 <pic:pic>
                   <pic:nvPicPr>
-                    <pic:cNvPr id="0" name="index.png"/>
+                    <pic:cNvPr id="0" name="theme-dark-index.png"/>
                     <pic:cNvPicPr/>
                   </pic:nvPicPr>
                   <pic:blipFill>
-                    <a:blip r:embed="rId9"/>
+                    <a:blip r:embed="rId14"/>
                     <a:stretch>
                       <a:fillRect/>
                     </a:stretch>
@@ -1038,7 +1098,7 @@
                   <pic:spPr>
                     <a:xfrm>
                       <a:off x="0" y="0"/>
-                      <a:ext cx="5669280" cy="4207669"/>
+                      <a:ext cx="5669280" cy="4429125"/>
                     </a:xfrm>
                     <a:prstGeom prst="rect"/>
                   </pic:spPr>
@@ -1058,7 +1118,109 @@
           <w:i/>
           <w:sz w:val="18"/>
         </w:rPr>
-        <w:t>Figure 6: Live website running on GitHub Pages.</w:t>
+        <w:t>Figure 6: Home page - dark theme (toggled with the CSS-only switch).</w:t>
+      </w:r>
+    </w:p>
+    <w:p>
+      <w:pPr>
+        <w:jc w:val="center"/>
+      </w:pPr>
+      <w:r>
+        <w:drawing>
+          <wp:inline xmlns:a="http://schemas.openxmlformats.org/drawingml/2006/main" xmlns:pic="http://schemas.openxmlformats.org/drawingml/2006/picture">
+            <wp:extent cx="5669280" cy="4429125"/>
+            <wp:docPr id="7" name="Picture 7"/>
+            <wp:cNvGraphicFramePr>
+              <a:graphicFrameLocks noChangeAspect="1"/>
+            </wp:cNvGraphicFramePr>
+            <a:graphic>
+              <a:graphicData uri="http://schemas.openxmlformats.org/drawingml/2006/picture">
+                <pic:pic>
+                  <pic:nvPicPr>
+                    <pic:cNvPr id="0" name="theme-dark-gallery.png"/>
+                    <pic:cNvPicPr/>
+                  </pic:nvPicPr>
+                  <pic:blipFill>
+                    <a:blip r:embed="rId15"/>
+                    <a:stretch>
+                      <a:fillRect/>
+                    </a:stretch>
+                  </pic:blipFill>
+                  <pic:spPr>
+                    <a:xfrm>
+                      <a:off x="0" y="0"/>
+                      <a:ext cx="5669280" cy="4429125"/>
+                    </a:xfrm>
+                    <a:prstGeom prst="rect"/>
+                  </pic:spPr>
+                </pic:pic>
+              </a:graphicData>
+            </a:graphic>
+          </wp:inline>
+        </w:drawing>
+      </w:r>
+    </w:p>
+    <w:p>
+      <w:pPr>
+        <w:jc w:val="center"/>
+      </w:pPr>
+      <w:r>
+        <w:rPr>
+          <w:i/>
+          <w:sz w:val="18"/>
+        </w:rPr>
+        <w:t>Figure 7: Image Gallery page - dark theme.</w:t>
+      </w:r>
+    </w:p>
+    <w:p>
+      <w:pPr>
+        <w:jc w:val="center"/>
+      </w:pPr>
+      <w:r>
+        <w:drawing>
+          <wp:inline xmlns:a="http://schemas.openxmlformats.org/drawingml/2006/main" xmlns:pic="http://schemas.openxmlformats.org/drawingml/2006/picture">
+            <wp:extent cx="5669280" cy="4429125"/>
+            <wp:docPr id="8" name="Picture 8"/>
+            <wp:cNvGraphicFramePr>
+              <a:graphicFrameLocks noChangeAspect="1"/>
+            </wp:cNvGraphicFramePr>
+            <a:graphic>
+              <a:graphicData uri="http://schemas.openxmlformats.org/drawingml/2006/picture">
+                <pic:pic>
+                  <pic:nvPicPr>
+                    <pic:cNvPr id="0" name="live-index.png"/>
+                    <pic:cNvPicPr/>
+                  </pic:nvPicPr>
+                  <pic:blipFill>
+                    <a:blip r:embed="rId16"/>
+                    <a:stretch>
+                      <a:fillRect/>
+                    </a:stretch>
+                  </pic:blipFill>
+                  <pic:spPr>
+                    <a:xfrm>
+                      <a:off x="0" y="0"/>
+                      <a:ext cx="5669280" cy="4429125"/>
+                    </a:xfrm>
+                    <a:prstGeom prst="rect"/>
+                  </pic:spPr>
+                </pic:pic>
+              </a:graphicData>
+            </a:graphic>
+          </wp:inline>
+        </w:drawing>
+      </w:r>
+    </w:p>
+    <w:p>
+      <w:pPr>
+        <w:jc w:val="center"/>
+      </w:pPr>
+      <w:r>
+        <w:rPr>
+          <w:i/>
+          <w:sz w:val="18"/>
+        </w:rPr>
+        <w:t>Figure 8: The live website running on GitHub Pages.</w:t>
       </w:r>
     </w:p>
     <w:p>
@@ -1076,13 +1238,13 @@
           <w:i w:val="0"/>
           <w:sz w:val="22"/>
         </w:rPr>
-        <w:t xml:space="preserve">GitHub Repository: </w:t>
+        <w:t>GitHub Repository:</w:t>
       </w:r>
     </w:p>
     <w:p>
       <w:r>
         <w:rPr>
-          <w:color w:val="16324F"/>
+          <w:color w:val="6366F1"/>
         </w:rPr>
         <w:t>https://github.com/anithepani/portfolio</w:t>
       </w:r>
@@ -1094,13 +1256,13 @@
           <w:i w:val="0"/>
           <w:sz w:val="22"/>
         </w:rPr>
-        <w:t xml:space="preserve">Live Portfolio (GitHub Pages): </w:t>
+        <w:t>Live Portfolio (GitHub Pages):</w:t>
       </w:r>
     </w:p>
     <w:p>
       <w:r>
         <w:rPr>
-          <w:color w:val="16324F"/>
+          <w:color w:val="6366F1"/>
         </w:rPr>
         <w:t>https://anithepani.github.io/portfolio/</w:t>
       </w:r>
@@ -1134,7 +1296,7 @@
         <w:pStyle w:val="ListBullet"/>
       </w:pPr>
       <w:r>
-        <w:t>The folder structure is clean – CSS and images are organized in their own folders.</w:t>
+        <w:t>The folder structure is clean - CSS and images are organized in their own folders.</w:t>
       </w:r>
     </w:p>
     <w:p>
@@ -1150,7 +1312,7 @@
         <w:pStyle w:val="ListBullet"/>
       </w:pPr>
       <w:r>
-        <w:t>No JavaScript and no CSS framework/API was used anywhere in the project.</w:t>
+        <w:t>No JavaScript and no CSS framework/API was used anywhere in the project (the theme toggle is pure CSS).</w:t>
       </w:r>
     </w:p>
     <w:p>
@@ -1219,6 +1381,14 @@
     </w:p>
     <w:p>
       <w:pPr>
+        <w:pStyle w:val="ListNumber"/>
+      </w:pPr>
+      <w:r>
+        <w:t>Extended the design with a modern UI, light/dark theme, hover effects and subtle animations (pure CSS).</w:t>
+      </w:r>
+    </w:p>
+    <w:p>
+      <w:pPr>
         <w:pStyle w:val="Heading1"/>
       </w:pPr>
       <w:r>
@@ -1232,7 +1402,7 @@
           <w:i w:val="0"/>
           <w:sz w:val="22"/>
         </w:rPr>
-        <w:t>In this lab I successfully converted my Lab 2 portfolio into a professionally organized and deployed website. I learned how to separate structure (HTML) from presentation (external CSS), how to use float and clear to build simple layouts, how to manage a project with Git and GitHub, and how to publish a website live using GitHub Pages.</w:t>
+        <w:t>In this lab I successfully converted my Lab 2 portfolio into a professionally organized, modern and deployed website. I learned how to separate structure (HTML) from presentation (external CSS), how to use float and clear to build simple layouts, how to build a light/dark theme and subtle CSS animations without JavaScript, how to manage a project with Git and GitHub, and how to publish a website live using GitHub Pages.</w:t>
       </w:r>
     </w:p>
     <w:sectPr>

</xml_diff>